<commit_message>
chore: bekleyen tüm çalışma ağacı değişikliklerini senkronize et
</commit_message>
<xml_diff>
--- a/tez-yazim/02_sablonlar/docx/marmara-reference.docx
+++ b/tez-yazim/02_sablonlar/docx/marmara-reference.docx
@@ -7,7 +7,9 @@
         <w:pStyle w:val="Title"/>
       </w:pPr>
       <w:r>
-        <w:t xml:space="preserve">Title</w:t>
+        <w:t xml:space="preserve">
+Title
+</w:t>
       </w:r>
     </w:p>
     <w:p>
@@ -15,7 +17,9 @@
         <w:pStyle w:val="Subtitle"/>
       </w:pPr>
       <w:r>
-        <w:t xml:space="preserve">Subtitle</w:t>
+        <w:t xml:space="preserve">
+Subtitle
+</w:t>
       </w:r>
     </w:p>
     <w:p>
@@ -23,7 +27,9 @@
         <w:pStyle w:val="Author"/>
       </w:pPr>
       <w:r>
-        <w:t xml:space="preserve">Author</w:t>
+        <w:t xml:space="preserve">
+Author
+</w:t>
       </w:r>
     </w:p>
     <w:p>
@@ -31,7 +37,9 @@
         <w:pStyle w:val="Date"/>
       </w:pPr>
       <w:r>
-        <w:t xml:space="preserve">Date</w:t>
+        <w:t xml:space="preserve">
+Date
+</w:t>
       </w:r>
     </w:p>
     <w:p>
@@ -39,7 +47,9 @@
         <w:pStyle w:val="Abstract"/>
       </w:pPr>
       <w:r>
-        <w:t xml:space="preserve">Abstract</w:t>
+        <w:t xml:space="preserve">
+Abstract
+</w:t>
       </w:r>
     </w:p>
     <w:p>
@@ -48,7 +58,9 @@
       </w:pPr>
       <w:bookmarkStart w:id="21" w:name="heading-1"/>
       <w:r>
-        <w:t xml:space="preserve">Heading 1</w:t>
+        <w:t xml:space="preserve">
+Heading 1
+</w:t>
       </w:r>
       <w:bookmarkEnd w:id="21"/>
     </w:p>
@@ -58,7 +70,9 @@
       </w:pPr>
       <w:bookmarkStart w:id="22" w:name="heading-2"/>
       <w:r>
-        <w:t xml:space="preserve">Heading 2</w:t>
+        <w:t xml:space="preserve">
+Heading 2
+</w:t>
       </w:r>
       <w:bookmarkEnd w:id="22"/>
     </w:p>
@@ -68,7 +82,9 @@
       </w:pPr>
       <w:bookmarkStart w:id="23" w:name="heading-3"/>
       <w:r>
-        <w:t xml:space="preserve">Heading 3</w:t>
+        <w:t xml:space="preserve">
+Heading 3
+</w:t>
       </w:r>
       <w:bookmarkEnd w:id="23"/>
     </w:p>
@@ -78,7 +94,9 @@
       </w:pPr>
       <w:bookmarkStart w:id="24" w:name="heading-4"/>
       <w:r>
-        <w:t xml:space="preserve">Heading 4</w:t>
+        <w:t xml:space="preserve">
+Heading 4
+</w:t>
       </w:r>
       <w:bookmarkEnd w:id="24"/>
     </w:p>
@@ -88,7 +106,9 @@
       </w:pPr>
       <w:bookmarkStart w:id="25" w:name="heading-5"/>
       <w:r>
-        <w:t xml:space="preserve">Heading 5</w:t>
+        <w:t xml:space="preserve">
+Heading 5
+</w:t>
       </w:r>
       <w:bookmarkEnd w:id="25"/>
     </w:p>
@@ -98,7 +118,9 @@
       </w:pPr>
       <w:bookmarkStart w:id="26" w:name="heading-6"/>
       <w:r>
-        <w:t xml:space="preserve">Heading 6</w:t>
+        <w:t xml:space="preserve">
+Heading 6
+</w:t>
       </w:r>
       <w:bookmarkEnd w:id="26"/>
     </w:p>
@@ -108,7 +130,9 @@
       </w:pPr>
       <w:bookmarkStart w:id="27" w:name="heading-7"/>
       <w:r>
-        <w:t xml:space="preserve">Heading 7</w:t>
+        <w:t xml:space="preserve">
+Heading 7
+</w:t>
       </w:r>
       <w:bookmarkEnd w:id="27"/>
     </w:p>
@@ -118,7 +142,9 @@
       </w:pPr>
       <w:bookmarkStart w:id="28" w:name="heading-8"/>
       <w:r>
-        <w:t xml:space="preserve">Heading 8</w:t>
+        <w:t xml:space="preserve">
+Heading 8
+</w:t>
       </w:r>
       <w:bookmarkEnd w:id="28"/>
     </w:p>
@@ -128,7 +154,9 @@
       </w:pPr>
       <w:bookmarkStart w:id="29" w:name="heading-9"/>
       <w:r>
-        <w:t xml:space="preserve">Heading 9</w:t>
+        <w:t xml:space="preserve">
+Heading 9
+</w:t>
       </w:r>
       <w:bookmarkEnd w:id="29"/>
     </w:p>
@@ -137,7 +165,9 @@
         <w:pStyle w:val="FirstParagraph"/>
       </w:pPr>
       <w:r>
-        <w:t xml:space="preserve">First Paragraph.</w:t>
+        <w:t xml:space="preserve">
+First Paragraph.
+</w:t>
       </w:r>
     </w:p>
     <w:p>
@@ -145,39 +175,54 @@
         <w:pStyle w:val="BodyText"/>
       </w:pPr>
       <w:r>
-        <w:t xml:space="preserve">Body Text. Body Text Char.</w:t>
-      </w:r>
-      <w:r>
-        <w:t xml:space="preserve"> </w:t>
+        <w:t xml:space="preserve">
+Body Text. Body Text Char.
+</w:t>
+      </w:r>
+      <w:r>
+        <w:t xml:space="preserve">
+</w:t>
       </w:r>
       <w:r>
         <w:rPr>
           <w:rStyle w:val="VerbatimChar"/>
         </w:rPr>
-        <w:t xml:space="preserve">Verbatim Char</w:t>
-      </w:r>
-      <w:r>
-        <w:t xml:space="preserve">.</w:t>
-      </w:r>
-      <w:r>
-        <w:t xml:space="preserve"> </w:t>
+        <w:t xml:space="preserve">
+Verbatim Char
+</w:t>
+      </w:r>
+      <w:r>
+        <w:t xml:space="preserve">
+.
+</w:t>
+      </w:r>
+      <w:r>
+        <w:t xml:space="preserve">
+</w:t>
       </w:r>
       <w:hyperlink r:id="rId30">
         <w:r>
           <w:rPr>
             <w:rStyle w:val="Hyperlink"/>
           </w:rPr>
-          <w:t xml:space="preserve">Hyperlink</w:t>
+          <w:t xml:space="preserve">
+Hyperlink
+</w:t>
         </w:r>
       </w:hyperlink>
       <w:r>
-        <w:t xml:space="preserve">.</w:t>
-      </w:r>
-      <w:r>
-        <w:t xml:space="preserve"> </w:t>
-      </w:r>
-      <w:r>
-        <w:t xml:space="preserve">Footnote.</w:t>
+        <w:t xml:space="preserve">
+.
+</w:t>
+      </w:r>
+      <w:r>
+        <w:t xml:space="preserve">
+</w:t>
+      </w:r>
+      <w:r>
+        <w:t xml:space="preserve">
+Footnote.
+</w:t>
       </w:r>
       <w:r>
         <w:rPr>
@@ -191,7 +236,9 @@
         <w:pStyle w:val="BlockText"/>
       </w:pPr>
       <w:r>
-        <w:t xml:space="preserve">Block Text.</w:t>
+        <w:t xml:space="preserve">
+Block Text.
+</w:t>
       </w:r>
     </w:p>
     <w:p>
@@ -199,7 +246,9 @@
         <w:pStyle w:val="TableCaption"/>
       </w:pPr>
       <w:r>
-        <w:t xml:space="preserve">Table caption.</w:t>
+        <w:t xml:space="preserve">
+Table caption.
+</w:t>
       </w:r>
     </w:p>
     <w:tbl>
@@ -226,7 +275,9 @@
               <w:jc w:val="left"/>
             </w:pPr>
             <w:r>
-              <w:t xml:space="preserve">Table</w:t>
+              <w:t xml:space="preserve">
+Table
+</w:t>
             </w:r>
           </w:p>
         </w:tc>
@@ -243,7 +294,9 @@
               <w:jc w:val="left"/>
             </w:pPr>
             <w:r>
-              <w:t xml:space="preserve">Table</w:t>
+              <w:t xml:space="preserve">
+Table
+</w:t>
             </w:r>
           </w:p>
         </w:tc>
@@ -256,7 +309,9 @@
               <w:jc w:val="left"/>
             </w:pPr>
             <w:r>
-              <w:t xml:space="preserve">1</w:t>
+              <w:t xml:space="preserve">
+1
+</w:t>
             </w:r>
           </w:p>
         </w:tc>
@@ -267,7 +322,9 @@
               <w:jc w:val="left"/>
             </w:pPr>
             <w:r>
-              <w:t xml:space="preserve">2</w:t>
+              <w:t xml:space="preserve">
+2
+</w:t>
             </w:r>
           </w:p>
         </w:tc>
@@ -278,7 +335,9 @@
         <w:pStyle w:val="ImageCaption"/>
       </w:pPr>
       <w:r>
-        <w:t xml:space="preserve">Image Caption</w:t>
+        <w:t xml:space="preserve">
+Image Caption
+</w:t>
       </w:r>
     </w:p>
     <w:p>
@@ -286,7 +345,9 @@
         <w:pStyle w:val="DefinitionTerm"/>
       </w:pPr>
       <w:r>
-        <w:t xml:space="preserve">DefinitionTerm</w:t>
+        <w:t xml:space="preserve">
+DefinitionTerm
+</w:t>
       </w:r>
     </w:p>
     <w:p>
@@ -294,7 +355,9 @@
         <w:pStyle w:val="Definition"/>
       </w:pPr>
       <w:r>
-        <w:t xml:space="preserve">Definition</w:t>
+        <w:t xml:space="preserve">
+Definition
+</w:t>
       </w:r>
     </w:p>
     <w:p>
@@ -302,7 +365,9 @@
         <w:pStyle w:val="DefinitionTerm"/>
       </w:pPr>
       <w:r>
-        <w:t xml:space="preserve">DefinitionTerm</w:t>
+        <w:t xml:space="preserve">
+DefinitionTerm
+</w:t>
       </w:r>
     </w:p>
     <w:p>
@@ -310,16 +375,12 @@
         <w:pStyle w:val="Definition"/>
       </w:pPr>
       <w:r>
-        <w:t xml:space="preserve">Definition</w:t>
-      </w:r>
-    </w:p>
-    <w:sectPr>
-      <w:footnotePr>
-        <w:numRestart w:val="eachSect"/>
-      </w:footnotePr>
-      <w:pgSz w:w="11906" w:h="16838"/>
-      <w:pgMar w:top="1134" w:right="1417" w:bottom="1134" w:left="1417" w:header="708" w:footer="708" w:gutter="0"/>
-    </w:sectPr>
+        <w:t xml:space="preserve">
+Definition
+</w:t>
+      </w:r>
+    </w:p>
+    <w:sectPr/>
   </w:body>
 </w:document>
 </file>
@@ -356,15 +417,10 @@
         <w:footnoteRef/>
       </w:r>
       <w:r>
-        <w:t>Footnote Text.</w:t>
-      </w:r>
-    </w:p>
-    <w:p>
-      <w:pPr>
-        <w:pStyle w:val="FootnoteBlockText"/>
-      </w:pPr>
-      <w:r>
-        <w:t>Footnote Block Text</w:t>
+        <w:t xml:space="preserve"> </w:t>
+      </w:r>
+      <w:r>
+        <w:t xml:space="preserve">Footnote Text.</w:t>
       </w:r>
     </w:p>
   </w:footnote>
@@ -566,6 +622,8 @@
     <w:rsid w:val="00A10FD9"/>
     <w:rPr>
       <w:rFonts w:asciiTheme="majorHAnsi" w:eastAsiaTheme="majorEastAsia" w:hAnsiTheme="majorHAnsi" w:cstheme="majorBidi"/>
+      <w:spacing w:val="-10"/>
+      <w:kern w:val="28"/>
       <w:sz w:val="56"/>
       <w:szCs w:val="56"/>
     </w:rPr>
@@ -607,12 +665,12 @@
   </w:style>
   <w:style w:type="paragraph" w:customStyle="1" w:styleId="Author">
     <w:name w:val="Author"/>
-    <w:basedOn w:val="Title"/>
     <w:next w:val="BodyText"/>
     <w:qFormat/>
     <w:pPr>
       <w:keepNext/>
       <w:keepLines/>
+      <w:jc w:val="center"/>
     </w:pPr>
     <w:rPr>
       <w:rFonts w:ascii="Times New Roman" w:hAnsi="Times New Roman" w:cs="Times New Roman"/>
@@ -624,17 +682,13 @@
   </w:style>
   <w:style w:type="paragraph" w:styleId="Date">
     <w:name w:val="Date"/>
-    <w:basedOn w:val="Title"/>
     <w:next w:val="BodyText"/>
     <w:qFormat/>
     <w:pPr>
       <w:keepNext/>
       <w:keepLines/>
-    </w:pPr>
-    <w:rPr>
-      <w:sz w:val="24"/>
-      <w:szCs w:val="24"/>
-    </w:rPr>
+      <w:jc w:val="center"/>
+    </w:pPr>
   </w:style>
   <w:style w:type="paragraph" w:customStyle="1" w:styleId="AbstractTitle">
     <w:name w:val="Abstract Title"/>
@@ -1071,6 +1125,13 @@
       </w:tblCellMar>
     </w:tblPr>
     <w:tblStylePr w:type="firstRow">
+      <w:tblPr>
+        <w:jc w:val="left"/>
+        <w:tblInd w:w="0" w:type="dxa"/>
+      </w:tblPr>
+      <w:trPr>
+        <w:jc w:val="left"/>
+      </w:trPr>
       <w:tcPr>
         <w:tcBorders>
           <w:bottom w:val="single"/>
@@ -1101,6 +1162,8 @@
     <w:basedOn w:val="Normal"/>
     <w:link w:val="BodyTextChar"/>
     <w:pPr>
+      <w:keepNext/>
+      <w:keepLines/>
       <w:spacing w:before="120" w:after="120" w:line="240" w:lineRule="auto"/>
       <w:jc w:val="both"/>
     </w:pPr>
@@ -1115,6 +1178,8 @@
     <w:name w:val="Table Caption"/>
     <w:basedOn w:val="Caption"/>
     <w:pPr>
+      <w:keepNext/>
+      <w:keepLines/>
       <w:spacing w:before="120" w:after="120" w:line="240" w:lineRule="auto"/>
       <w:jc w:val="both"/>
     </w:pPr>
@@ -1128,6 +1193,8 @@
   <w:style w:type="paragraph" w:customStyle="1" w:styleId="ImageCaption">
     <w:name w:val="Image Caption"/>
     <w:pPr>
+      <w:keepNext/>
+      <w:keepLines/>
       <w:spacing w:before="120" w:after="120" w:line="240" w:lineRule="auto"/>
       <w:jc w:val="both"/>
     </w:pPr>
@@ -1205,7 +1272,7 @@
     <w:uiPriority w:val="39"/>
     <w:pPr>
       <w:tabs>
-        <w:tab w:val="right" w:leader="dot" w:pos="9072"/>
+        <w:tab w:val="right" w:pos="9072"/>
       </w:tabs>
       <w:spacing w:before="0" w:after="0" w:line="360" w:lineRule="auto"/>
       <w:jc w:val="left"/>
@@ -1226,7 +1293,7 @@
     <w:uiPriority w:val="39"/>
     <w:pPr>
       <w:tabs>
-        <w:tab w:val="right" w:leader="dot" w:pos="9072"/>
+        <w:tab w:val="right" w:pos="9072"/>
       </w:tabs>
       <w:spacing w:before="0" w:after="0" w:line="276" w:lineRule="auto"/>
       <w:ind w:left="220"/>
@@ -1246,7 +1313,7 @@
     <w:uiPriority w:val="39"/>
     <w:pPr>
       <w:tabs>
-        <w:tab w:val="right" w:leader="dot" w:pos="9072"/>
+        <w:tab w:val="right" w:pos="9072"/>
       </w:tabs>
       <w:spacing w:before="0" w:after="0" w:line="276" w:lineRule="auto"/>
       <w:ind w:left="440"/>
@@ -1266,7 +1333,7 @@
     <w:uiPriority w:val="39"/>
     <w:pPr>
       <w:tabs>
-        <w:tab w:val="right" w:leader="dot" w:pos="9072"/>
+        <w:tab w:val="right" w:pos="9072"/>
       </w:tabs>
       <w:spacing w:before="0" w:after="0" w:line="276" w:lineRule="auto"/>
       <w:ind w:left="660"/>
@@ -1286,7 +1353,7 @@
     <w:uiPriority w:val="39"/>
     <w:pPr>
       <w:tabs>
-        <w:tab w:val="right" w:leader="dot" w:pos="9072"/>
+        <w:tab w:val="right" w:pos="9072"/>
       </w:tabs>
       <w:spacing w:before="0" w:after="0" w:line="276" w:lineRule="auto"/>
       <w:ind w:left="880"/>
@@ -1306,7 +1373,7 @@
     <w:uiPriority w:val="39"/>
     <w:pPr>
       <w:tabs>
-        <w:tab w:val="right" w:leader="dot" w:pos="9072"/>
+        <w:tab w:val="right" w:pos="9072"/>
       </w:tabs>
       <w:spacing w:before="0" w:after="0" w:line="276" w:lineRule="auto"/>
       <w:ind w:left="1100"/>
@@ -1326,7 +1393,7 @@
     <w:uiPriority w:val="39"/>
     <w:pPr>
       <w:tabs>
-        <w:tab w:val="right" w:leader="dot" w:pos="9072"/>
+        <w:tab w:val="right" w:pos="9072"/>
       </w:tabs>
       <w:spacing w:before="0" w:after="0" w:line="276" w:lineRule="auto"/>
       <w:ind w:left="1320"/>
@@ -1346,7 +1413,7 @@
     <w:uiPriority w:val="39"/>
     <w:pPr>
       <w:tabs>
-        <w:tab w:val="right" w:leader="dot" w:pos="9072"/>
+        <w:tab w:val="right" w:pos="9072"/>
       </w:tabs>
       <w:spacing w:before="0" w:after="0" w:line="276" w:lineRule="auto"/>
       <w:ind w:left="1540"/>
@@ -1366,7 +1433,7 @@
     <w:uiPriority w:val="39"/>
     <w:pPr>
       <w:tabs>
-        <w:tab w:val="right" w:leader="dot" w:pos="9072"/>
+        <w:tab w:val="right" w:pos="9072"/>
       </w:tabs>
       <w:spacing w:before="0" w:after="0" w:line="276" w:lineRule="auto"/>
       <w:ind w:left="1760"/>
@@ -1386,7 +1453,7 @@
     <w:uiPriority w:val="99"/>
     <w:pPr>
       <w:tabs>
-        <w:tab w:val="right" w:leader="dot" w:pos="9072"/>
+        <w:tab w:val="right" w:pos="9072"/>
       </w:tabs>
       <w:spacing w:before="0" w:after="0" w:line="276" w:lineRule="auto"/>
       <w:ind w:left="567" w:hanging="567"/>

</xml_diff>